<commit_message>
Remove retired BEAM branding; fix outdated names; templates as references
Templates no longer carry "BEAM Builder Template Pack" footers, and brain
sources credit the template pack and Joshua Grech directly. Outdated
names are corrected: Victoria's Building and Plumbing Commission (not the
VBA), Before You Dig Australia (not Dial Before You Dig), NCC (not BCA),
a state-neutral WHS regulator on the incident report, and no 50% deposit
in the estimate quote terms. The defects guide now describes statutory
warranties accurately by state.

PDFs are generated from brain pages by tools/build_pdfs.py, so they can't
drift from the brain again. tools/describe_templates.py writes a Structure
outline into every document page, so documents can be produced in any
format or on the user's own letterhead; every skill says how.

Co-Authored-By: Claude Opus 5.5 <noreply@anthropic.com>
</commit_message>
<xml_diff>
--- a/templates/word/Back_Charge_Notice_TEMPLATE.docx
+++ b/templates/word/Back_Charge_Notice_TEMPLATE.docx
@@ -1311,22 +1311,6 @@
           <w:szCs w:val="20"/>
         </w:rPr>
         <w:t xml:space="preserve">Received by: _________________________ (Subcontractor) Date: _____________</w:t>
-      </w:r>
-    </w:p>
-    <w:p>
-      <w:pPr>
-        <w:spacing w:before="200"/>
-      </w:pPr>
-      <w:r>
-        <w:rPr>
-          <w:rFonts w:ascii="Calibri" w:cs="Calibri" w:eastAsia="Calibri" w:hAnsi="Calibri"/>
-          <w:i/>
-          <w:iCs/>
-          <w:color w:val="888888"/>
-          <w:sz w:val="16"/>
-          <w:szCs w:val="16"/>
-        </w:rPr>
-        <w:t xml:space="preserve">This template is part of the BEAM Builder Template Pack. beam-it.com.au</w:t>
       </w:r>
     </w:p>
     <w:sectPr>

</xml_diff>